<commit_message>
Polish Milestone 1 report wording
</commit_message>
<xml_diff>
--- a/docs/FinTrace_Milestone1_Report.docx
+++ b/docs/FinTrace_Milestone1_Report.docx
@@ -19,7 +19,7 @@
         <w:rPr>
           <w:rFonts w:ascii="Arial" w:hAnsi="Arial" w:cs="Arial"/>
         </w:rPr>
-        <w:t>An Evidence-Grounded RAG Assistant for Corporate Financial Reports</w:t>
+        <w:t>A RAG Assistant with Traceable Evidence for Corporate Financial Reports</w:t>
       </w:r>
     </w:p>
     <w:p>
@@ -118,7 +118,7 @@
           <w:sz w:val="20"/>
           <w:szCs w:val="20"/>
         </w:rPr>
-        <w:t>As a finance-reporting or investor-relations analyst, I want to ask questions about corporate reports and check stated figures against the authoritative source pages, so that I can spot inconsistencies quickly and review the supporting evidence before sign-off.</w:t>
+        <w:t>As an analyst working in financial reporting or investor relations, I want to ask questions about corporate reports and check stated figures against the authoritative source pages so that I can spot inconsistencies quickly and review the supporting evidence before approval.</w:t>
       </w:r>
     </w:p>
     <w:p>
@@ -156,7 +156,7 @@
           <w:sz w:val="20"/>
           <w:szCs w:val="20"/>
         </w:rPr>
-        <w:t>FinTrace will answer questions with citations to the report and page used. It will also compare a submitted figure or claim with the relevant disclosure and return one of four outcomes: Supported, Mismatch, Superseded, or Unable to verify. The result will show the supporting source and any calculation performed.</w:t>
+        <w:t>FinTrace will answer questions with citations to the report and page used. It will also compare a submitted figure or claim with the relevant disclosure and return one of four outcomes: Supported, Mismatch, Superseded or Unable to verify. The result will show the source and any calculation performed.</w:t>
       </w:r>
     </w:p>
     <w:p>
@@ -688,7 +688,7 @@
                 <w:sz w:val="20"/>
                 <w:szCs w:val="20"/>
               </w:rPr>
-              <w:t>RAG and Information Retrieval: chunking, BM25/vector search, embeddings and local-model integration</w:t>
+              <w:t>RAG and Information Retrieval: chunking, BM25/vector search, embeddings and integration of a local model</w:t>
             </w:r>
           </w:p>
         </w:tc>
@@ -1097,7 +1097,7 @@
           <w:sz w:val="20"/>
           <w:szCs w:val="20"/>
         </w:rPr>
-        <w:t xml:space="preserve">Our six-member group is registered as WIL Project 9, and we began by choosing a domain together. We weighed </w:t>
+        <w:t>Our group of six is registered as WIL Project 9 and we began by choosing a domain together. We compared four options: consumer health, an RMIT student FAQ, rental repairs and financial reporting. We assessed them against four criteria for a RAG project: access to authoritative public sources, the ability to write questions with known answers, evaluation beyond simple accuracy and clear stakeholder value. We chose financial reporting because it met all four criteria. A stated figure can be checked against its source and the system must also know when to abstain. We then agreed to start with a handful of authoritative corporate reports, evidence linked to page numbers and a limited set of financial metrics.</w:t>
       </w:r>
       <w:r>
         <w:rPr>
@@ -1105,7 +1105,6 @@
           <w:sz w:val="20"/>
           <w:szCs w:val="20"/>
         </w:rPr>
-        <w:t>four</w:t>
       </w:r>
       <w:r>
         <w:rPr>
@@ -1113,7 +1112,6 @@
           <w:sz w:val="20"/>
           <w:szCs w:val="20"/>
         </w:rPr>
-        <w:t xml:space="preserve"> candidates, consumer health, an RMIT student FAQ</w:t>
       </w:r>
       <w:r>
         <w:rPr>
@@ -1121,7 +1119,6 @@
           <w:sz w:val="20"/>
           <w:szCs w:val="20"/>
         </w:rPr>
-        <w:t>, Rental repair</w:t>
       </w:r>
       <w:r>
         <w:rPr>
@@ -1129,7 +1126,6 @@
           <w:sz w:val="20"/>
           <w:szCs w:val="20"/>
         </w:rPr>
-        <w:t xml:space="preserve"> and financial reporting, against four criteria that matter for a RAG project: access to authoritative public sources, whether we could write questions with known answers, whether evaluation could go beyond simple accuracy, and how clearly the value could be explained to a stakeholder. We chose financial reporting because it scores well on all four</w:t>
       </w:r>
       <w:r>
         <w:rPr>
@@ -1137,7 +1133,6 @@
           <w:sz w:val="20"/>
           <w:szCs w:val="20"/>
         </w:rPr>
-        <w:t xml:space="preserve">, as </w:t>
       </w:r>
       <w:r>
         <w:rPr>
@@ -1145,7 +1140,6 @@
           <w:sz w:val="20"/>
           <w:szCs w:val="20"/>
         </w:rPr>
-        <w:t xml:space="preserve">a stated figure can be checked against its source, and the system must also know when to abstain. We then agreed </w:t>
       </w:r>
       <w:r>
         <w:rPr>
@@ -1153,7 +1147,6 @@
           <w:sz w:val="20"/>
           <w:szCs w:val="20"/>
         </w:rPr>
-        <w:t>to start with</w:t>
       </w:r>
       <w:r>
         <w:rPr>
@@ -1161,7 +1154,6 @@
           <w:sz w:val="20"/>
           <w:szCs w:val="20"/>
         </w:rPr>
-        <w:t xml:space="preserve"> handful of authoritative corporate reports, page-level evidence and a limited set of financial metrics.</w:t>
       </w:r>
     </w:p>
     <w:p>
@@ -1199,7 +1191,7 @@
           <w:sz w:val="20"/>
           <w:szCs w:val="20"/>
         </w:rPr>
-        <w:t>We split the work into six workstreams, matched each to a member's declared skills, and drafted and agreed the aim statement together. A private GitHub repository and a Trello board are in place; the repository README records our Group ID, members and working aim, and we track progress on the board by linking each deliverable to a card and a commit.</w:t>
+        <w:t>We split the work into six workstreams and matched each one to a member's declared skills. We also drafted and agreed on the aim together. A private GitHub repository and Trello board are in place. The README records our Group ID, members and working aim. We track progress by linking each deliverable to a Trello card and Git commit.</w:t>
       </w:r>
     </w:p>
     <w:p>
@@ -1239,7 +1231,7 @@
           <w:szCs w:val="20"/>
           <w:lang w:val="en-IN"/>
         </w:rPr>
-        <w:t xml:space="preserve">Each member has begun work in their assigned area. Yash is identifying suitable corporate reports and recording their sources and versions. Janhavi is developing the test-question format and answer keys, including questions that should remain unanswered. Shriram is reviewing the reproduced BM25 baseline and planning the dense and hybrid retrieval components. Guruprasad is defining the supported financial metrics, normalisation rules and verification outcomes. Hashini is planning how evidence will be presented in the prototype and identifying Responsible AI checks. Ayushi completed the preliminary </w:t>
+        <w:t>Each member has begun work in their assigned area. Yash is identifying suitable corporate reports and recording their sources and versions. Janhavi is developing the format for test questions and answer keys, including questions that should remain unanswered. Guruprasad is reviewing the reproduced BM25 baseline and planning the dense and hybrid retrieval components. Shriram is defining the supported financial metrics, normalisation rules and verification outcomes. Hashini is planning how evidence will be presented in the prototype and identifying Responsible AI checks. Ayushi completed the preliminary Walert reproduction described below and is coordinating the system design and integration.</w:t>
       </w:r>
       <w:proofErr w:type="spellStart"/>
       <w:r>
@@ -1249,7 +1241,6 @@
           <w:szCs w:val="20"/>
           <w:lang w:val="en-IN"/>
         </w:rPr>
-        <w:t>Walert</w:t>
       </w:r>
       <w:proofErr w:type="spellEnd"/>
       <w:r>
@@ -1259,7 +1250,6 @@
           <w:szCs w:val="20"/>
           <w:lang w:val="en-IN"/>
         </w:rPr>
-        <w:t xml:space="preserve"> reproduction described below and is coordinating the system design and integration.</w:t>
       </w:r>
     </w:p>
     <w:p>
@@ -1319,7 +1309,7 @@
           <w:sz w:val="21"/>
           <w:szCs w:val="21"/>
         </w:rPr>
-        <w:t xml:space="preserve">We inspected the official </w:t>
+        <w:t>We inspected the official Walert project and rebuilt a BM25 retrieval baseline from its 120 FAQ passages. We evaluated all 106 released questions and saved reproducible rankings, metrics and input hashes. To compare retrieval strategies at no cost, we recomputed metrics from Walert's supplied BM25, dense and intent run files rather than running the Falcon-7B and Pyserini pipeline again. The results are below.</w:t>
       </w:r>
       <w:proofErr w:type="spellStart"/>
       <w:r>
@@ -1328,7 +1318,6 @@
           <w:sz w:val="21"/>
           <w:szCs w:val="21"/>
         </w:rPr>
-        <w:t>Walert</w:t>
       </w:r>
       <w:proofErr w:type="spellEnd"/>
       <w:r>
@@ -1337,7 +1326,6 @@
           <w:sz w:val="21"/>
           <w:szCs w:val="21"/>
         </w:rPr>
-        <w:t xml:space="preserve"> project and rebuilt a BM25 retrieval baseline from its 120 FAQ passages, evaluating all 106 released questions and saving reproducible rankings, metrics and input hashes. To compare retrieval strategies at no cost, we recomputed metrics directly from Walert's supplied BM25, dense and intent run files rather than re-executing the Falcon-7B and Pyserini pipeline. Results a</w:t>
       </w:r>
       <w:r>
         <w:rPr>
@@ -1345,7 +1333,6 @@
           <w:sz w:val="21"/>
           <w:szCs w:val="21"/>
         </w:rPr>
-        <w:t>re</w:t>
       </w:r>
       <w:r>
         <w:rPr>
@@ -1353,7 +1340,6 @@
           <w:sz w:val="21"/>
           <w:szCs w:val="21"/>
         </w:rPr>
-        <w:t xml:space="preserve"> below.</w:t>
       </w:r>
     </w:p>
     <w:p>
@@ -2269,7 +2255,7 @@
           <w:sz w:val="21"/>
           <w:szCs w:val="21"/>
         </w:rPr>
-        <w:t xml:space="preserve">our rebuilt BM25 closely tracks </w:t>
+        <w:t>Our rebuilt BM25 closely tracks Walert's supplied BM25 run. The dense run has the strongest graded ranking (nDCG@5 0.538) but the lowest Hit@5, so no single measure is sufficient. This motivates hybrid retrieval and an evaluation using several metrics. Retrieval was also weaker on inferred questions than on known questions. On questions outside the knowledge base, generators using Falcon refused only 0 to 20% of the time. This shows that the model may attempt unsupported answers. FinTrace will therefore evaluate evidence retrieval and safe refusal separately.</w:t>
       </w:r>
       <w:proofErr w:type="spellStart"/>
       <w:r>
@@ -2278,7 +2264,6 @@
           <w:sz w:val="21"/>
           <w:szCs w:val="21"/>
         </w:rPr>
-        <w:t>Walert's</w:t>
       </w:r>
       <w:proofErr w:type="spellEnd"/>
       <w:r>
@@ -2287,7 +2272,6 @@
           <w:sz w:val="21"/>
           <w:szCs w:val="21"/>
         </w:rPr>
-        <w:t xml:space="preserve"> supplied BM25 run. The dense run has the strongest graded ranking (nDCG@5 0.538) but the lowest Hit@5, so no single measure is sufficient; this motivates hybrid retrieval and a multi-metric evaluation. Retrieval was also weaker on inferred than known questions. On the out</w:t>
       </w:r>
       <w:r>
         <w:rPr>
@@ -2295,7 +2279,6 @@
           <w:sz w:val="21"/>
           <w:szCs w:val="21"/>
         </w:rPr>
-        <w:t xml:space="preserve"> </w:t>
       </w:r>
       <w:r>
         <w:rPr>
@@ -2303,7 +2286,6 @@
           <w:sz w:val="21"/>
           <w:szCs w:val="21"/>
         </w:rPr>
-        <w:t>of</w:t>
       </w:r>
       <w:r>
         <w:rPr>
@@ -2311,7 +2293,6 @@
           <w:sz w:val="21"/>
           <w:szCs w:val="21"/>
         </w:rPr>
-        <w:t xml:space="preserve"> </w:t>
       </w:r>
       <w:r>
         <w:rPr>
@@ -2319,7 +2300,6 @@
           <w:sz w:val="21"/>
           <w:szCs w:val="21"/>
         </w:rPr>
-        <w:t>KB questions the Falcon</w:t>
       </w:r>
       <w:r>
         <w:rPr>
@@ -2327,7 +2307,6 @@
           <w:sz w:val="21"/>
           <w:szCs w:val="21"/>
         </w:rPr>
-        <w:t xml:space="preserve"> </w:t>
       </w:r>
       <w:r>
         <w:rPr>
@@ -2335,7 +2314,6 @@
           <w:sz w:val="21"/>
           <w:szCs w:val="21"/>
         </w:rPr>
-        <w:t>based generators refused only 0-20% of the time, confirming that generation will attempt unsupported answers; FinTrace will therefore evaluate evidence retrieval and safe refusal as separate behaviours.</w:t>
       </w:r>
     </w:p>
     <w:p>
@@ -2512,7 +2490,7 @@
                 <w:sz w:val="21"/>
                 <w:szCs w:val="21"/>
               </w:rPr>
-              <w:t xml:space="preserve">Yash: bounded corpus and provenance manifest. Janhavi: </w:t>
+              <w:t>Yash: bounded corpus and provenance manifest. Janhavi: questions and answer keys. Guruprasad: stable BM25 baseline.</w:t>
             </w:r>
             <w:r>
               <w:rPr>
@@ -2520,7 +2498,6 @@
                 <w:sz w:val="21"/>
                 <w:szCs w:val="21"/>
               </w:rPr>
-              <w:t>Q</w:t>
             </w:r>
             <w:r>
               <w:rPr>
@@ -2528,7 +2505,6 @@
                 <w:sz w:val="21"/>
                 <w:szCs w:val="21"/>
               </w:rPr>
-              <w:t>uestions and answer keys. Guruprasad: stable BM25 baseline.</w:t>
             </w:r>
           </w:p>
         </w:tc>
@@ -2552,7 +2528,7 @@
                 <w:sz w:val="21"/>
                 <w:szCs w:val="21"/>
               </w:rPr>
-              <w:t>Fixed official-report set; page-aware chunks; answerable and unanswerable test questions; saved baseline metrics.</w:t>
+              <w:t>Fixed set of official reports; chunks linked to page numbers; answerable and unanswerable test questions; saved baseline metrics.</w:t>
             </w:r>
           </w:p>
         </w:tc>
@@ -2604,7 +2580,7 @@
                 <w:sz w:val="21"/>
                 <w:szCs w:val="21"/>
               </w:rPr>
-              <w:t>Guruprasad: dense/hybrid retrieval and local Qwen model. Shriram: financial normalisation and calculation engine. Ayushi: interfaces and integration.</w:t>
+              <w:t>Guruprasad: dense and hybrid retrieval with a local Qwen model. Shriram: financial normalisation and calculation engine. Ayushi: interfaces and integration.</w:t>
             </w:r>
           </w:p>
         </w:tc>
@@ -2628,7 +2604,7 @@
                 <w:sz w:val="21"/>
                 <w:szCs w:val="21"/>
               </w:rPr>
-              <w:t>BM25, dense and hybrid runs on one test set; unit, period and currency rules tested; evidence-linked answers generated locally.</w:t>
+              <w:t>BM25, dense and hybrid runs on one test set; unit, period and currency rules tested; answers linked to evidence and generated locally.</w:t>
             </w:r>
           </w:p>
         </w:tc>
@@ -2683,7 +2659,7 @@
                 <w:sz w:val="21"/>
                 <w:szCs w:val="21"/>
               </w:rPr>
-              <w:t>Hashini: evidence-based prototype and Responsible AI checks. Janhavi: final evaluation. Ayushi: end-to-end integration and rubric review.</w:t>
+              <w:t>Hashini: prototype for showing evidence and Responsible AI checks. Janhavi: final evaluation. Ayushi: full system integration and rubric review.</w:t>
             </w:r>
           </w:p>
         </w:tc>
@@ -2834,7 +2810,7 @@
                 <w:sz w:val="21"/>
                 <w:szCs w:val="21"/>
               </w:rPr>
-              <w:t>PDF tables or units extract incorrectly</w:t>
+              <w:t>PDF tables or units are extracted incorrectly</w:t>
             </w:r>
           </w:p>
         </w:tc>
@@ -2885,7 +2861,7 @@
                 <w:sz w:val="21"/>
                 <w:szCs w:val="21"/>
               </w:rPr>
-              <w:t>Unsupported or confident answers</w:t>
+              <w:t>Unsupported but confident answers</w:t>
             </w:r>
           </w:p>
         </w:tc>
@@ -2909,7 +2885,7 @@
                 <w:sz w:val="21"/>
                 <w:szCs w:val="21"/>
               </w:rPr>
-              <w:t>Require retrieved evidence and use Unable to verify when the threshold or source conditions are not met.</w:t>
+              <w:t>Require retrieved evidence and return Unable to verify when the threshold or source conditions are not met.</w:t>
             </w:r>
           </w:p>
         </w:tc>
@@ -3014,7 +2990,7 @@
                 <w:sz w:val="21"/>
                 <w:szCs w:val="21"/>
               </w:rPr>
-              <w:t>Use a fixed, small document collection and move additional companies, metrics and features to future work.</w:t>
+              <w:t>Use a small fixed document collection and move additional companies, metrics and features to future work.</w:t>
             </w:r>
           </w:p>
         </w:tc>
@@ -4167,7 +4143,7 @@
                 <w:sz w:val="17"/>
                 <w:szCs w:val="17"/>
               </w:rPr>
-              <w:t>Data-source research and provenance planning</w:t>
+              <w:t>Research on data sources and provenance planning</w:t>
             </w:r>
           </w:p>
         </w:tc>

</xml_diff>

<commit_message>
Correct Hashini student ID
</commit_message>
<xml_diff>
--- a/docs/FinTrace_Milestone1_Report.docx
+++ b/docs/FinTrace_Milestone1_Report.docx
@@ -859,7 +859,7 @@
                 <w:sz w:val="20"/>
                 <w:szCs w:val="20"/>
               </w:rPr>
-              <w:t>S4196172</w:t>
+              <w:t>S4163868</w:t>
             </w:r>
           </w:p>
         </w:tc>
@@ -4232,7 +4232,7 @@
                 <w:sz w:val="17"/>
                 <w:szCs w:val="17"/>
               </w:rPr>
-              <w:t>S4196172</w:t>
+              <w:t>S4163868</w:t>
             </w:r>
           </w:p>
         </w:tc>

</xml_diff>